<commit_message>
fix: resolve merge conflicts and finalize ML analysis + submission modules
</commit_message>
<xml_diff>
--- a/backend/python-ml/test_files/lecturer/Lecture template.docx
+++ b/backend/python-ml/test_files/lecturer/Lecture template.docx
@@ -25,7 +25,13 @@
         <w:rPr>
           <w:rFonts w:ascii="Times New Roman" w:hAnsi="Times New Roman" w:cs="Times New Roman"/>
         </w:rPr>
-        <w:t>Total Marks: 100</w:t>
+        <w:t>Total Marks: 10</w:t>
+      </w:r>
+      <w:r>
+        <w:rPr>
+          <w:rFonts w:ascii="Times New Roman" w:hAnsi="Times New Roman" w:cs="Times New Roman"/>
+        </w:rPr>
+        <w:t>0</w:t>
       </w:r>
     </w:p>
     <w:p>
@@ -39,7 +45,7 @@
           <w:rFonts w:ascii="Times New Roman" w:hAnsi="Times New Roman" w:cs="Times New Roman"/>
         </w:rPr>
         <w:pict w14:anchorId="48C2A146">
-          <v:rect id="_x0000_i1091" style="width:0;height:1.5pt" o:hralign="center" o:hrstd="t" o:hr="t" fillcolor="#a0a0a0" stroked="f"/>
+          <v:rect id="_x0000_i1025" style="width:0;height:1.5pt" o:hralign="center" o:hrstd="t" o:hr="t" fillcolor="#a0a0a0" stroked="f"/>
         </w:pict>
       </w:r>
     </w:p>
@@ -107,7 +113,7 @@
           <w:rFonts w:ascii="Times New Roman" w:hAnsi="Times New Roman" w:cs="Times New Roman"/>
         </w:rPr>
         <w:pict w14:anchorId="6DB1C7E7">
-          <v:rect id="_x0000_i1092" style="width:0;height:1.5pt" o:hralign="center" o:hrstd="t" o:hr="t" fillcolor="#a0a0a0" stroked="f"/>
+          <v:rect id="_x0000_i1026" style="width:0;height:1.5pt" o:hralign="center" o:hrstd="t" o:hr="t" fillcolor="#a0a0a0" stroked="f"/>
         </w:pict>
       </w:r>
     </w:p>
@@ -146,42 +152,14 @@
         <w:rPr>
           <w:rFonts w:ascii="Times New Roman" w:hAnsi="Times New Roman" w:cs="Times New Roman"/>
         </w:rPr>
-        <w:t xml:space="preserve">B1. Overall Use Case Diagram (Actors, System Boundary, </w:t>
-      </w:r>
-      <w:proofErr w:type="gramStart"/>
-      <w:r>
-        <w:rPr>
-          <w:rFonts w:ascii="Times New Roman" w:hAnsi="Times New Roman" w:cs="Times New Roman"/>
-        </w:rPr>
-        <w:t>Relationships) ..</w:t>
-      </w:r>
-      <w:proofErr w:type="gramEnd"/>
-      <w:r>
-        <w:rPr>
-          <w:rFonts w:ascii="Times New Roman" w:hAnsi="Times New Roman" w:cs="Times New Roman"/>
-        </w:rPr>
-        <w:t xml:space="preserve"> /10</w:t>
+        <w:t>B1. Overall Use Case Diagram (Actors, System Boundary, Relationships) .. /10</w:t>
       </w:r>
       <w:r>
         <w:rPr>
           <w:rFonts w:ascii="Times New Roman" w:hAnsi="Times New Roman" w:cs="Times New Roman"/>
         </w:rPr>
         <w:br/>
-        <w:t xml:space="preserve">B2. ER / EER Diagram (Entities, PK/FK, Cardinality, Normalization) </w:t>
-      </w:r>
-      <w:proofErr w:type="gramStart"/>
-      <w:r>
-        <w:rPr>
-          <w:rFonts w:ascii="Times New Roman" w:hAnsi="Times New Roman" w:cs="Times New Roman"/>
-        </w:rPr>
-        <w:t>.....</w:t>
-      </w:r>
-      <w:proofErr w:type="gramEnd"/>
-      <w:r>
-        <w:rPr>
-          <w:rFonts w:ascii="Times New Roman" w:hAnsi="Times New Roman" w:cs="Times New Roman"/>
-        </w:rPr>
-        <w:t xml:space="preserve"> /1</w:t>
+        <w:t>B2. ER / EER Diagram (Entities, PK/FK, Cardinality, Normalization) ..... /1</w:t>
       </w:r>
       <w:r>
         <w:rPr>
@@ -252,7 +230,7 @@
           <w:rFonts w:ascii="Times New Roman" w:hAnsi="Times New Roman" w:cs="Times New Roman"/>
         </w:rPr>
         <w:pict w14:anchorId="584EE213">
-          <v:rect id="_x0000_i1093" style="width:0;height:1.5pt" o:hralign="center" o:hrstd="t" o:hr="t" fillcolor="#a0a0a0" stroked="f"/>
+          <v:rect id="_x0000_i1027" style="width:0;height:1.5pt" o:hralign="center" o:hrstd="t" o:hr="t" fillcolor="#a0a0a0" stroked="f"/>
         </w:pict>
       </w:r>
     </w:p>
@@ -327,7 +305,7 @@
           <w:rFonts w:ascii="Times New Roman" w:hAnsi="Times New Roman" w:cs="Times New Roman"/>
         </w:rPr>
         <w:pict w14:anchorId="6543E82A">
-          <v:rect id="_x0000_i1094" style="width:0;height:1.5pt" o:hralign="center" o:hrstd="t" o:hr="t" fillcolor="#a0a0a0" stroked="f"/>
+          <v:rect id="_x0000_i1028" style="width:0;height:1.5pt" o:hralign="center" o:hrstd="t" o:hr="t" fillcolor="#a0a0a0" stroked="f"/>
         </w:pict>
       </w:r>
     </w:p>
@@ -388,7 +366,7 @@
           <w:rFonts w:ascii="Times New Roman" w:hAnsi="Times New Roman" w:cs="Times New Roman"/>
         </w:rPr>
         <w:pict w14:anchorId="792E775C">
-          <v:rect id="_x0000_i1095" style="width:0;height:1.5pt" o:hralign="center" o:hrstd="t" o:hr="t" fillcolor="#a0a0a0" stroked="f"/>
+          <v:rect id="_x0000_i1029" style="width:0;height:1.5pt" o:hralign="center" o:hrstd="t" o:hr="t" fillcolor="#a0a0a0" stroked="f"/>
         </w:pict>
       </w:r>
     </w:p>
@@ -464,7 +442,7 @@
           <w:rFonts w:ascii="Times New Roman" w:hAnsi="Times New Roman" w:cs="Times New Roman"/>
         </w:rPr>
         <w:pict w14:anchorId="06A5F80A">
-          <v:rect id="_x0000_i1096" style="width:0;height:1.5pt" o:hralign="center" o:hrstd="t" o:hr="t" fillcolor="#a0a0a0" stroked="f"/>
+          <v:rect id="_x0000_i1030" style="width:0;height:1.5pt" o:hralign="center" o:hrstd="t" o:hr="t" fillcolor="#a0a0a0" stroked="f"/>
         </w:pict>
       </w:r>
     </w:p>
@@ -1129,6 +1107,7 @@
   <w:style w:type="character" w:default="1" w:styleId="DefaultParagraphFont">
     <w:name w:val="Default Paragraph Font"/>
     <w:uiPriority w:val="1"/>
+    <w:semiHidden/>
     <w:unhideWhenUsed/>
   </w:style>
   <w:style w:type="table" w:default="1" w:styleId="TableNormal">

</xml_diff>